<commit_message>
feat: implement form for Mau 13 Giay moi
</commit_message>
<xml_diff>
--- a/webapp/templates/TOTRINH/11_Mau_Giay_trieu_tap.docx
+++ b/webapp/templates/TOTRINH/11_Mau_Giay_trieu_tap.docx
@@ -700,6 +700,12 @@
       </w:r>
     </w:p>
     <w:p>
+      <w:pPr/>
+      <w:r>
+        <w:t>(CONTENT)</w:t>
+      </w:r>
+    </w:p>
+    <w:p>
       <w:pPr>
         <w:pStyle w:val="BodyText"/>
         <w:rPr>
@@ -707,283 +713,6 @@
           <w:sz w:val="24"/>
         </w:rPr>
       </w:pPr>
-    </w:p>
-    <w:p>
-      <w:pPr>
-        <w:pStyle w:val="BodyText"/>
-        <w:tabs>
-          <w:tab w:val="left" w:pos="567"/>
-        </w:tabs>
-        <w:rPr>
-          <w:rFonts w:ascii="Times New Roman" w:hAnsi="Times New Roman"/>
-        </w:rPr>
-      </w:pPr>
-      <w:r>
-        <w:rPr>
-          <w:rFonts w:ascii="Times New Roman" w:hAnsi="Times New Roman"/>
-        </w:rPr>
-        <w:tab/>
-        <w:t>Giám đốc …….quyết định triệu tập “Hội nghị………................……...</w:t>
-      </w:r>
-    </w:p>
-    <w:p>
-      <w:pPr>
-        <w:pStyle w:val="BodyText"/>
-        <w:tabs>
-          <w:tab w:val="left" w:pos="567"/>
-        </w:tabs>
-        <w:spacing w:before="120"/>
-        <w:rPr>
-          <w:rFonts w:ascii="Times New Roman" w:hAnsi="Times New Roman"/>
-        </w:rPr>
-      </w:pPr>
-      <w:r>
-        <w:rPr>
-          <w:rFonts w:ascii="Times New Roman" w:hAnsi="Times New Roman"/>
-        </w:rPr>
-        <w:tab/>
-        <w:t>1. Thời gian và địa điểm:</w:t>
-      </w:r>
-    </w:p>
-    <w:p>
-      <w:pPr>
-        <w:pStyle w:val="BodyText"/>
-        <w:tabs>
-          <w:tab w:val="left" w:pos="567"/>
-        </w:tabs>
-        <w:rPr>
-          <w:rFonts w:ascii="Times New Roman" w:hAnsi="Times New Roman"/>
-        </w:rPr>
-      </w:pPr>
-      <w:r>
-        <w:rPr>
-          <w:rFonts w:ascii="Times New Roman" w:hAnsi="Times New Roman"/>
-        </w:rPr>
-        <w:tab/>
-      </w:r>
-      <w:r>
-        <w:rPr>
-          <w:rFonts w:ascii="Times New Roman" w:hAnsi="Times New Roman"/>
-          <w:b/>
-        </w:rPr>
-        <w:t>- Thời gian</w:t>
-      </w:r>
-      <w:r>
-        <w:rPr>
-          <w:rFonts w:ascii="Times New Roman" w:hAnsi="Times New Roman"/>
-          <w:b/>
-        </w:rPr>
-        <w:t xml:space="preserve">: </w:t>
-      </w:r>
-      <w:r>
-        <w:rPr>
-          <w:rFonts w:ascii="Times New Roman" w:hAnsi="Times New Roman"/>
-        </w:rPr>
-        <w:t>Hội nghị làm việc trong…...ngày,…./.../...200. đến …/…/20., khai mạc lúc…h00 ngày…/…/20..</w:t>
-      </w:r>
-    </w:p>
-    <w:p>
-      <w:pPr>
-        <w:pStyle w:val="BodyText"/>
-        <w:tabs>
-          <w:tab w:val="left" w:pos="567"/>
-        </w:tabs>
-        <w:rPr>
-          <w:rFonts w:ascii="Times New Roman" w:hAnsi="Times New Roman"/>
-        </w:rPr>
-      </w:pPr>
-      <w:r>
-        <w:rPr>
-          <w:rFonts w:ascii="Times New Roman" w:hAnsi="Times New Roman"/>
-        </w:rPr>
-        <w:tab/>
-      </w:r>
-      <w:r>
-        <w:rPr>
-          <w:rFonts w:ascii="Times New Roman" w:hAnsi="Times New Roman"/>
-          <w:b/>
-        </w:rPr>
-        <w:t>- Địa điểm:</w:t>
-      </w:r>
-      <w:r>
-        <w:rPr>
-          <w:rFonts w:ascii="Times New Roman" w:hAnsi="Times New Roman"/>
-        </w:rPr>
-        <w:t>……………………….</w:t>
-      </w:r>
-    </w:p>
-    <w:p>
-      <w:pPr>
-        <w:pStyle w:val="BodyText"/>
-        <w:tabs>
-          <w:tab w:val="left" w:pos="567"/>
-        </w:tabs>
-        <w:spacing w:before="120"/>
-        <w:rPr>
-          <w:rFonts w:ascii="Times New Roman" w:hAnsi="Times New Roman"/>
-        </w:rPr>
-      </w:pPr>
-      <w:r>
-        <w:rPr>
-          <w:rFonts w:ascii="Times New Roman" w:hAnsi="Times New Roman"/>
-        </w:rPr>
-        <w:tab/>
-        <w:t>2. Thành phần (có danh sách kèm theo)</w:t>
-      </w:r>
-    </w:p>
-    <w:p>
-      <w:pPr>
-        <w:pStyle w:val="BodyText"/>
-        <w:tabs>
-          <w:tab w:val="left" w:pos="567"/>
-        </w:tabs>
-        <w:rPr>
-          <w:rFonts w:ascii="Times New Roman" w:hAnsi="Times New Roman"/>
-        </w:rPr>
-      </w:pPr>
-      <w:r>
-        <w:rPr>
-          <w:rFonts w:ascii="Times New Roman" w:hAnsi="Times New Roman"/>
-        </w:rPr>
-        <w:tab/>
-        <w:t>a. Khối cơ quan….:</w:t>
-      </w:r>
-    </w:p>
-    <w:p>
-      <w:pPr>
-        <w:pStyle w:val="BodyText"/>
-        <w:tabs>
-          <w:tab w:val="left" w:pos="567"/>
-        </w:tabs>
-        <w:rPr>
-          <w:rFonts w:ascii="Times New Roman" w:hAnsi="Times New Roman"/>
-        </w:rPr>
-      </w:pPr>
-      <w:r>
-        <w:rPr>
-          <w:rFonts w:ascii="Times New Roman" w:hAnsi="Times New Roman"/>
-        </w:rPr>
-        <w:tab/>
-        <w:t>b. Các đơn vị trực thuộc:</w:t>
-      </w:r>
-    </w:p>
-    <w:p>
-      <w:pPr>
-        <w:pStyle w:val="BodyText"/>
-        <w:tabs>
-          <w:tab w:val="left" w:pos="567"/>
-        </w:tabs>
-        <w:spacing w:before="120"/>
-        <w:rPr>
-          <w:rFonts w:ascii="Times New Roman" w:hAnsi="Times New Roman"/>
-        </w:rPr>
-      </w:pPr>
-      <w:r>
-        <w:rPr>
-          <w:rFonts w:ascii="Times New Roman" w:hAnsi="Times New Roman"/>
-        </w:rPr>
-        <w:tab/>
-        <w:t>3. Tổ chức triển khai</w:t>
-      </w:r>
-    </w:p>
-    <w:p>
-      <w:pPr>
-        <w:pStyle w:val="BodyText"/>
-        <w:tabs>
-          <w:tab w:val="left" w:pos="567"/>
-        </w:tabs>
-        <w:rPr>
-          <w:rFonts w:ascii="Times New Roman" w:hAnsi="Times New Roman"/>
-          <w:sz w:val="20"/>
-        </w:rPr>
-      </w:pPr>
-      <w:r>
-        <w:rPr>
-          <w:rFonts w:ascii="Times New Roman" w:hAnsi="Times New Roman"/>
-        </w:rPr>
-        <w:tab/>
-        <w:t>- Các đơn vị tham dự đủ, đúng thành phần..</w:t>
-      </w:r>
-      <w:r>
-        <w:rPr>
-          <w:rFonts w:ascii="Times New Roman" w:hAnsi="Times New Roman"/>
-          <w:sz w:val="23"/>
-          <w:szCs w:val="23"/>
-        </w:rPr>
-        <w:t>(nêu phương tiện đi lại của đại biểu)</w:t>
-      </w:r>
-      <w:r>
-        <w:rPr>
-          <w:rFonts w:ascii="Times New Roman" w:hAnsi="Times New Roman"/>
-          <w:sz w:val="20"/>
-        </w:rPr>
-        <w:t>…</w:t>
-      </w:r>
-    </w:p>
-    <w:p>
-      <w:pPr>
-        <w:pStyle w:val="BodyText"/>
-        <w:tabs>
-          <w:tab w:val="left" w:pos="567"/>
-        </w:tabs>
-        <w:rPr>
-          <w:rFonts w:ascii="Times New Roman" w:hAnsi="Times New Roman"/>
-        </w:rPr>
-      </w:pPr>
-      <w:r>
-        <w:rPr>
-          <w:rFonts w:ascii="Times New Roman" w:hAnsi="Times New Roman"/>
-        </w:rPr>
-        <w:tab/>
-        <w:t>- Ban tổ chức Hội nghị đón tiếp và phát tài liệu tới các đại biểu, bắt đầu từ…h00, ngày…/…/200. tại…………..(điện thoại liên hệ………………..).</w:t>
-      </w:r>
-    </w:p>
-    <w:p>
-      <w:pPr>
-        <w:pStyle w:val="BodyText"/>
-        <w:tabs>
-          <w:tab w:val="left" w:pos="567"/>
-        </w:tabs>
-        <w:rPr>
-          <w:rFonts w:ascii="Times New Roman" w:hAnsi="Times New Roman"/>
-          <w:szCs w:val="28"/>
-        </w:rPr>
-      </w:pPr>
-      <w:r>
-        <w:rPr>
-          <w:rFonts w:ascii="Times New Roman" w:hAnsi="Times New Roman"/>
-          <w:sz w:val="24"/>
-        </w:rPr>
-        <w:tab/>
-      </w:r>
-      <w:r>
-        <w:rPr>
-          <w:rFonts w:ascii="Times New Roman" w:hAnsi="Times New Roman"/>
-          <w:szCs w:val="28"/>
-        </w:rPr>
-        <w:t>- Trong quá trình triển khai, nếu có vướng mắc phát sinh, đề nghị liên hệ với Ban tổ chức Hội nghị, số điện thoại:………………….để phối hợp giải quyết.</w:t>
-      </w:r>
-    </w:p>
-    <w:p>
-      <w:pPr>
-        <w:pStyle w:val="BodyText"/>
-        <w:tabs>
-          <w:tab w:val="left" w:pos="567"/>
-        </w:tabs>
-        <w:spacing w:before="120"/>
-        <w:rPr>
-          <w:rFonts w:ascii="Times New Roman" w:hAnsi="Times New Roman"/>
-          <w:szCs w:val="28"/>
-        </w:rPr>
-      </w:pPr>
-      <w:r>
-        <w:rPr>
-          <w:rFonts w:ascii="Times New Roman" w:hAnsi="Times New Roman"/>
-          <w:szCs w:val="28"/>
-        </w:rPr>
-        <w:tab/>
-        <w:t>Đề nghị các đơn vị phối hợp triển khai để Hội nghị đạt kết quả./.</w:t>
-      </w:r>
     </w:p>
     <w:p>
       <w:pPr>

</xml_diff>